<commit_message>
chore(night-shift): Regenerate editable activity teacher guides
</commit_message>
<xml_diff>
--- a/teacher-tools/activity-guides/10-4-activity-teacher.docx
+++ b/teacher-tools/activity-guides/10-4-activity-teacher.docx
@@ -587,58 +587,6 @@
           <w:szCs w:val="22"/>
         </w:rPr>
         <w:t xml:space="preserve">Least → Greatest wrapping paper</w:t>
-      </w:r>
-    </w:p>
-    <w:p>
-      <w:pPr>
-        <w:spacing w:after="30" w:before="0"/>
-      </w:pPr>
-      <w:r>
-        <w:rPr>
-          <w:rFonts w:ascii="Calibri" w:cs="Calibri" w:eastAsia="Calibri" w:hAnsi="Calibri"/>
-          <w:sz w:val="22"/>
-          <w:szCs w:val="22"/>
-        </w:rPr>
-        <w:t xml:space="preserve">•  Cube capsule 4×4×4: SA = 96 in²</w:t>
-      </w:r>
-    </w:p>
-    <w:p>
-      <w:pPr>
-        <w:spacing w:after="30" w:before="0"/>
-      </w:pPr>
-      <w:r>
-        <w:rPr>
-          <w:rFonts w:ascii="Calibri" w:cs="Calibri" w:eastAsia="Calibri" w:hAnsi="Calibri"/>
-          <w:sz w:val="22"/>
-          <w:szCs w:val="22"/>
-        </w:rPr>
-        <w:t xml:space="preserve">•  Rect capsule 3×4×5: SA = 94 in²</w:t>
-      </w:r>
-    </w:p>
-    <w:p>
-      <w:pPr>
-        <w:spacing w:after="30" w:before="0"/>
-      </w:pPr>
-      <w:r>
-        <w:rPr>
-          <w:rFonts w:ascii="Calibri" w:cs="Calibri" w:eastAsia="Calibri" w:hAnsi="Calibri"/>
-          <w:sz w:val="22"/>
-          <w:szCs w:val="22"/>
-        </w:rPr>
-        <w:t xml:space="preserve">•  Rect capsule 6×5×4: SA = 148 in²</w:t>
-      </w:r>
-    </w:p>
-    <w:p>
-      <w:pPr>
-        <w:spacing w:after="30" w:before="0"/>
-      </w:pPr>
-      <w:r>
-        <w:rPr>
-          <w:rFonts w:ascii="Calibri" w:cs="Calibri" w:eastAsia="Calibri" w:hAnsi="Calibri"/>
-          <w:sz w:val="22"/>
-          <w:szCs w:val="22"/>
-        </w:rPr>
-        <w:t xml:space="preserve">•  Tri capsule (ends 8×6, length 10): SA = 288 in²</w:t>
       </w:r>
     </w:p>
     <w:p>

</xml_diff>